<commit_message>
TS 3.1-3.3 Jatai Ghanam final pushed
</commit_message>
<xml_diff>
--- a/TS Jatai Ghanam Project/TS 3.1/TS 3.1 Ghanam Tamil Corrections.docx
+++ b/TS Jatai Ghanam Project/TS 3.1/TS 3.1 Ghanam Tamil Corrections.docx
@@ -17188,7 +17188,6 @@
                 <w:cs/>
                 <w:lang w:bidi="ta-IN"/>
               </w:rPr>
-              <w:lastRenderedPageBreak/>
               <w:t>22</w:t>
             </w:r>
             <w:r>
@@ -19199,19 +19198,6 @@
         </w:rPr>
         <w:t>==========</w:t>
       </w:r>
-    </w:p>
-    <w:p/>
-    <w:p>
-      <w:pPr>
-        <w:spacing w:before="0" w:line="240" w:lineRule="auto"/>
-        <w:rPr>
-          <w:b/>
-          <w:bCs/>
-          <w:sz w:val="32"/>
-          <w:szCs w:val="32"/>
-          <w:u w:val="single"/>
-        </w:rPr>
-      </w:pPr>
     </w:p>
     <w:sectPr>
       <w:headerReference w:type="even" r:id="rId7"/>

</xml_diff>